<commit_message>
v.3.3.2: centraliza titulo do sumario e formata em caixa alta
Versão anterior: v.3.3.1
Nova versão: v.3.3.2

Alterações:
- Centralizado o título do Sumário no relatório Word (.docx) e formatado em caixa alta ("SUMÁRIO").
- Atualizados os estilos TOCHeading e CabealhodoSumrio para alinhamento centralizado.
- Atualizado o título no fallback visual HTML para centralizado e em caixa alta.
- Atualizado o documento oficial gerado em output/16CTE_Relatório_V01.docx com o novo padrão visual.
- Atualizado versionamento para v.3.3.2 no rodapé principal, menu lateral e em todos os arquivos JavaScript.

Validações:
- Validação completa via automação com Microsoft Word COM e Microsoft Edge headless.
- Confirmado alinhamento centralizado (<w:jc w:val="center"/>) e texto "SUMÁRIO" no XML do documento.
- Preservada integridade das coleções TablesOfContents e TablesOfFigures e sincronia da paginação.
- Versionamento v.3.3.2 validado em todos os pontos do DOM e nos scripts.
</commit_message>
<xml_diff>
--- a/output/16CTE_Relatório_V01.docx
+++ b/output/16CTE_Relatório_V01.docx
@@ -44,7 +44,7 @@
                 <w:noProof/>
               </w:rPr>
               <w:drawing>
-                <wp:inline distT="0" distB="0" distL="0" distR="0" wp14:anchorId="77DBC737" wp14:editId="45767327">
+                <wp:inline distT="0" distB="0" distL="0" distR="0" wp14:anchorId="347CFF3F" wp14:editId="3A58E27D">
                   <wp:extent cx="4857750" cy="2714625"/>
                   <wp:effectExtent l="0" t="0" r="0" b="0"/>
                   <wp:docPr id="1" name="Imagem 1"/>
@@ -279,10 +279,10 @@
                       <w:noProof/>
                     </w:rPr>
                     <w:drawing>
-                      <wp:inline distT="0" distB="0" distL="0" distR="0" wp14:anchorId="6C2C87D7" wp14:editId="036439CC">
+                      <wp:inline distT="0" distB="0" distL="0" distR="0" wp14:anchorId="7EF59DA3" wp14:editId="2FAD7A51">
                         <wp:extent cx="1666875" cy="352425"/>
                         <wp:effectExtent l="0" t="0" r="0" b="0"/>
-                        <wp:docPr id="368310637" name="Imagem 368310637"/>
+                        <wp:docPr id="1716576624" name="Imagem 1716576624"/>
                         <wp:cNvGraphicFramePr>
                           <a:graphicFrameLocks xmlns:a="http://schemas.openxmlformats.org/drawingml/2006/main" noChangeAspect="1"/>
                         </wp:cNvGraphicFramePr>
@@ -333,10 +333,10 @@
                       <w:noProof/>
                     </w:rPr>
                     <w:drawing>
-                      <wp:inline distT="0" distB="0" distL="0" distR="0" wp14:anchorId="3709EFCC" wp14:editId="134130CA">
+                      <wp:inline distT="0" distB="0" distL="0" distR="0" wp14:anchorId="2D3A31E5" wp14:editId="2C98E812">
                         <wp:extent cx="904875" cy="352425"/>
                         <wp:effectExtent l="0" t="0" r="0" b="0"/>
-                        <wp:docPr id="2139036437" name="Imagem 2139036437"/>
+                        <wp:docPr id="1837252567" name="Imagem 1837252567"/>
                         <wp:cNvGraphicFramePr>
                           <a:graphicFrameLocks xmlns:a="http://schemas.openxmlformats.org/drawingml/2006/main" noChangeAspect="1"/>
                         </wp:cNvGraphicFramePr>
@@ -387,10 +387,10 @@
                       <w:noProof/>
                     </w:rPr>
                     <w:drawing>
-                      <wp:inline distT="0" distB="0" distL="0" distR="0" wp14:anchorId="46F97A64" wp14:editId="6BD93354">
+                      <wp:inline distT="0" distB="0" distL="0" distR="0" wp14:anchorId="010BD821" wp14:editId="3E6F1872">
                         <wp:extent cx="1571625" cy="352425"/>
                         <wp:effectExtent l="0" t="0" r="0" b="0"/>
-                        <wp:docPr id="1875198144" name="Imagem 1875198144"/>
+                        <wp:docPr id="953892902" name="Imagem 953892902"/>
                         <wp:cNvGraphicFramePr>
                           <a:graphicFrameLocks xmlns:a="http://schemas.openxmlformats.org/drawingml/2006/main" noChangeAspect="1"/>
                         </wp:cNvGraphicFramePr>
@@ -644,10 +644,10 @@
                 <w:noProof/>
               </w:rPr>
               <w:drawing>
-                <wp:inline distT="0" distB="0" distL="0" distR="0" wp14:anchorId="06931807" wp14:editId="540D776B">
+                <wp:inline distT="0" distB="0" distL="0" distR="0" wp14:anchorId="47099891" wp14:editId="562EDF19">
                   <wp:extent cx="1666875" cy="352425"/>
                   <wp:effectExtent l="0" t="0" r="0" b="0"/>
-                  <wp:docPr id="1214938882" name="Imagem 1214938882"/>
+                  <wp:docPr id="1755328644" name="Imagem 1755328644"/>
                   <wp:cNvGraphicFramePr>
                     <a:graphicFrameLocks xmlns:a="http://schemas.openxmlformats.org/drawingml/2006/main" noChangeAspect="1"/>
                   </wp:cNvGraphicFramePr>
@@ -699,10 +699,10 @@
                 <w:noProof/>
               </w:rPr>
               <w:drawing>
-                <wp:inline distT="0" distB="0" distL="0" distR="0" wp14:anchorId="23AB2A86" wp14:editId="788B2AAC">
+                <wp:inline distT="0" distB="0" distL="0" distR="0" wp14:anchorId="5F31958D" wp14:editId="0C432967">
                   <wp:extent cx="904875" cy="352425"/>
                   <wp:effectExtent l="0" t="0" r="0" b="0"/>
-                  <wp:docPr id="1017621148" name="Imagem 1017621148"/>
+                  <wp:docPr id="1141236435" name="Imagem 1141236435"/>
                   <wp:cNvGraphicFramePr>
                     <a:graphicFrameLocks xmlns:a="http://schemas.openxmlformats.org/drawingml/2006/main" noChangeAspect="1"/>
                   </wp:cNvGraphicFramePr>
@@ -754,10 +754,10 @@
                 <w:noProof/>
               </w:rPr>
               <w:drawing>
-                <wp:inline distT="0" distB="0" distL="0" distR="0" wp14:anchorId="0DF0FA14" wp14:editId="70B692D3">
+                <wp:inline distT="0" distB="0" distL="0" distR="0" wp14:anchorId="07980C78" wp14:editId="6F2305F9">
                   <wp:extent cx="1571625" cy="352425"/>
                   <wp:effectExtent l="0" t="0" r="0" b="0"/>
-                  <wp:docPr id="1153787223" name="Imagem 1153787223"/>
+                  <wp:docPr id="1990150151" name="Imagem 1990150151"/>
                   <wp:cNvGraphicFramePr>
                     <a:graphicFrameLocks xmlns:a="http://schemas.openxmlformats.org/drawingml/2006/main" noChangeAspect="1"/>
                   </wp:cNvGraphicFramePr>
@@ -1178,7 +1178,7 @@
     <w:sdt>
       <w:sdtPr>
         <w:alias w:val="Índice de Figuras"/>
-        <w:id w:val="320464296"/>
+        <w:id w:val="-781642117"/>
       </w:sdtPr>
       <w:sdtEndPr>
         <w:rPr>
@@ -1207,7 +1207,7 @@
           <w:r>
             <w:fldChar w:fldCharType="separate"/>
           </w:r>
-          <w:hyperlink w:anchor="_Toc242025251" w:history="1">
+          <w:hyperlink w:anchor="_Toc242026093" w:history="1">
             <w:r>
               <w:rPr>
                 <w:rStyle w:val="Hyperlink"/>
@@ -1234,7 +1234,7 @@
                 <w:noProof/>
                 <w:webHidden/>
               </w:rPr>
-              <w:instrText xml:space="preserve"> PAGEREF _Toc242025251 \h </w:instrText>
+              <w:instrText xml:space="preserve"> PAGEREF _Toc242026093 \h </w:instrText>
             </w:r>
             <w:r>
               <w:rPr>
@@ -1276,7 +1276,7 @@
               <w14:ligatures w14:val="standardContextual"/>
             </w:rPr>
           </w:pPr>
-          <w:hyperlink w:anchor="_Toc242025252" w:history="1">
+          <w:hyperlink w:anchor="_Toc242026094" w:history="1">
             <w:r>
               <w:rPr>
                 <w:rStyle w:val="Hyperlink"/>
@@ -1303,7 +1303,7 @@
                 <w:noProof/>
                 <w:webHidden/>
               </w:rPr>
-              <w:instrText xml:space="preserve"> PAGEREF _Toc242025252 \h </w:instrText>
+              <w:instrText xml:space="preserve"> PAGEREF _Toc242026094 \h </w:instrText>
             </w:r>
             <w:r>
               <w:rPr>
@@ -1345,7 +1345,7 @@
               <w14:ligatures w14:val="standardContextual"/>
             </w:rPr>
           </w:pPr>
-          <w:hyperlink w:anchor="_Toc242025253" w:history="1">
+          <w:hyperlink w:anchor="_Toc242026095" w:history="1">
             <w:r>
               <w:rPr>
                 <w:rStyle w:val="Hyperlink"/>
@@ -1372,7 +1372,7 @@
                 <w:noProof/>
                 <w:webHidden/>
               </w:rPr>
-              <w:instrText xml:space="preserve"> PAGEREF _Toc242025253 \h </w:instrText>
+              <w:instrText xml:space="preserve"> PAGEREF _Toc242026095 \h </w:instrText>
             </w:r>
             <w:r>
               <w:rPr>
@@ -1414,7 +1414,7 @@
               <w14:ligatures w14:val="standardContextual"/>
             </w:rPr>
           </w:pPr>
-          <w:hyperlink w:anchor="_Toc242025254" w:history="1">
+          <w:hyperlink w:anchor="_Toc242026096" w:history="1">
             <w:r>
               <w:rPr>
                 <w:rStyle w:val="Hyperlink"/>
@@ -1441,7 +1441,7 @@
                 <w:noProof/>
                 <w:webHidden/>
               </w:rPr>
-              <w:instrText xml:space="preserve"> PAGEREF _Toc242025254 \h </w:instrText>
+              <w:instrText xml:space="preserve"> PAGEREF _Toc242026096 \h </w:instrText>
             </w:r>
             <w:r>
               <w:rPr>
@@ -1483,7 +1483,7 @@
               <w14:ligatures w14:val="standardContextual"/>
             </w:rPr>
           </w:pPr>
-          <w:hyperlink w:anchor="_Toc242025255" w:history="1">
+          <w:hyperlink w:anchor="_Toc242026097" w:history="1">
             <w:r>
               <w:rPr>
                 <w:rStyle w:val="Hyperlink"/>
@@ -1510,7 +1510,7 @@
                 <w:noProof/>
                 <w:webHidden/>
               </w:rPr>
-              <w:instrText xml:space="preserve"> PAGEREF _Toc242025255 \h </w:instrText>
+              <w:instrText xml:space="preserve"> PAGEREF _Toc242026097 \h </w:instrText>
             </w:r>
             <w:r>
               <w:rPr>
@@ -1552,7 +1552,7 @@
               <w14:ligatures w14:val="standardContextual"/>
             </w:rPr>
           </w:pPr>
-          <w:hyperlink w:anchor="_Toc242025256" w:history="1">
+          <w:hyperlink w:anchor="_Toc242026098" w:history="1">
             <w:r>
               <w:rPr>
                 <w:rStyle w:val="Hyperlink"/>
@@ -1579,7 +1579,7 @@
                 <w:noProof/>
                 <w:webHidden/>
               </w:rPr>
-              <w:instrText xml:space="preserve"> PAGEREF _Toc242025256 \h </w:instrText>
+              <w:instrText xml:space="preserve"> PAGEREF _Toc242026098 \h </w:instrText>
             </w:r>
             <w:r>
               <w:rPr>
@@ -1621,7 +1621,7 @@
               <w14:ligatures w14:val="standardContextual"/>
             </w:rPr>
           </w:pPr>
-          <w:hyperlink w:anchor="_Toc242025257" w:history="1">
+          <w:hyperlink w:anchor="_Toc242026099" w:history="1">
             <w:r>
               <w:rPr>
                 <w:rStyle w:val="Hyperlink"/>
@@ -1648,7 +1648,7 @@
                 <w:noProof/>
                 <w:webHidden/>
               </w:rPr>
-              <w:instrText xml:space="preserve"> PAGEREF _Toc242025257 \h </w:instrText>
+              <w:instrText xml:space="preserve"> PAGEREF _Toc242026099 \h </w:instrText>
             </w:r>
             <w:r>
               <w:rPr>
@@ -1690,7 +1690,7 @@
               <w14:ligatures w14:val="standardContextual"/>
             </w:rPr>
           </w:pPr>
-          <w:hyperlink w:anchor="_Toc242025258" w:history="1">
+          <w:hyperlink w:anchor="_Toc242026100" w:history="1">
             <w:r>
               <w:rPr>
                 <w:rStyle w:val="Hyperlink"/>
@@ -1717,7 +1717,7 @@
                 <w:noProof/>
                 <w:webHidden/>
               </w:rPr>
-              <w:instrText xml:space="preserve"> PAGEREF _Toc242025258 \h </w:instrText>
+              <w:instrText xml:space="preserve"> PAGEREF _Toc242026100 \h </w:instrText>
             </w:r>
             <w:r>
               <w:rPr>
@@ -1774,7 +1774,7 @@
     <w:sdt>
       <w:sdtPr>
         <w:alias w:val="Índice de Tabelas"/>
-        <w:id w:val="-1090234059"/>
+        <w:id w:val="-1495643424"/>
       </w:sdtPr>
       <w:sdtEndPr>
         <w:rPr>
@@ -1803,7 +1803,7 @@
           <w:r>
             <w:fldChar w:fldCharType="separate"/>
           </w:r>
-          <w:hyperlink w:anchor="_Toc242025259" w:history="1">
+          <w:hyperlink w:anchor="_Toc242026101" w:history="1">
             <w:r>
               <w:rPr>
                 <w:rStyle w:val="Hyperlink"/>
@@ -1830,7 +1830,7 @@
                 <w:noProof/>
                 <w:webHidden/>
               </w:rPr>
-              <w:instrText xml:space="preserve"> PAGEREF _Toc242025259 \h </w:instrText>
+              <w:instrText xml:space="preserve"> PAGEREF _Toc242026101 \h </w:instrText>
             </w:r>
             <w:r>
               <w:rPr>
@@ -1872,7 +1872,7 @@
               <w14:ligatures w14:val="standardContextual"/>
             </w:rPr>
           </w:pPr>
-          <w:hyperlink w:anchor="_Toc242025260" w:history="1">
+          <w:hyperlink w:anchor="_Toc242026102" w:history="1">
             <w:r>
               <w:rPr>
                 <w:rStyle w:val="Hyperlink"/>
@@ -1899,7 +1899,7 @@
                 <w:noProof/>
                 <w:webHidden/>
               </w:rPr>
-              <w:instrText xml:space="preserve"> PAGEREF _Toc242025260 \h </w:instrText>
+              <w:instrText xml:space="preserve"> PAGEREF _Toc242026102 \h </w:instrText>
             </w:r>
             <w:r>
               <w:rPr>
@@ -1941,7 +1941,7 @@
               <w14:ligatures w14:val="standardContextual"/>
             </w:rPr>
           </w:pPr>
-          <w:hyperlink w:anchor="_Toc242025261" w:history="1">
+          <w:hyperlink w:anchor="_Toc242026103" w:history="1">
             <w:r>
               <w:rPr>
                 <w:rStyle w:val="Hyperlink"/>
@@ -1968,7 +1968,7 @@
                 <w:noProof/>
                 <w:webHidden/>
               </w:rPr>
-              <w:instrText xml:space="preserve"> PAGEREF _Toc242025261 \h </w:instrText>
+              <w:instrText xml:space="preserve"> PAGEREF _Toc242026103 \h </w:instrText>
             </w:r>
             <w:r>
               <w:rPr>
@@ -2010,7 +2010,7 @@
               <w14:ligatures w14:val="standardContextual"/>
             </w:rPr>
           </w:pPr>
-          <w:hyperlink w:anchor="_Toc242025262" w:history="1">
+          <w:hyperlink w:anchor="_Toc242026104" w:history="1">
             <w:r>
               <w:rPr>
                 <w:rStyle w:val="Hyperlink"/>
@@ -2037,7 +2037,7 @@
                 <w:noProof/>
                 <w:webHidden/>
               </w:rPr>
-              <w:instrText xml:space="preserve"> PAGEREF _Toc242025262 \h </w:instrText>
+              <w:instrText xml:space="preserve"> PAGEREF _Toc242026104 \h </w:instrText>
             </w:r>
             <w:r>
               <w:rPr>
@@ -2090,7 +2090,7 @@
           <w:szCs w:val="22"/>
         </w:rPr>
         <w:alias w:val="Sumário"/>
-        <w:id w:val="-1558232419"/>
+        <w:id w:val="-985851576"/>
         <w:docPartObj>
           <w:docPartGallery w:val="Table of Contents"/>
           <w:docPartUnique/>
@@ -2101,10 +2101,9 @@
         <w:p>
           <w:pPr>
             <w:pStyle w:val="CabealhodoSumrio"/>
-            <w:jc w:val="left"/>
           </w:pPr>
           <w:r>
-            <w:t>Sumário</w:t>
+            <w:t>SUMÁRIO</w:t>
           </w:r>
         </w:p>
         <w:p>
@@ -2127,7 +2126,7 @@
           <w:r>
             <w:fldChar w:fldCharType="separate"/>
           </w:r>
-          <w:hyperlink w:anchor="_Toc242025241" w:history="1">
+          <w:hyperlink w:anchor="_Toc242026083" w:history="1">
             <w:r>
               <w:rPr>
                 <w:rStyle w:val="Hyperlink"/>
@@ -2154,7 +2153,7 @@
                 <w:noProof/>
                 <w:webHidden/>
               </w:rPr>
-              <w:instrText xml:space="preserve"> PAGEREF _Toc242025241 \h </w:instrText>
+              <w:instrText xml:space="preserve"> PAGEREF _Toc242026083 \h </w:instrText>
             </w:r>
             <w:r>
               <w:rPr>
@@ -2196,7 +2195,7 @@
               <w14:ligatures w14:val="standardContextual"/>
             </w:rPr>
           </w:pPr>
-          <w:hyperlink w:anchor="_Toc242025242" w:history="1">
+          <w:hyperlink w:anchor="_Toc242026084" w:history="1">
             <w:r>
               <w:rPr>
                 <w:rStyle w:val="Hyperlink"/>
@@ -2223,7 +2222,7 @@
                 <w:noProof/>
                 <w:webHidden/>
               </w:rPr>
-              <w:instrText xml:space="preserve"> PAGEREF _Toc242025242 \h </w:instrText>
+              <w:instrText xml:space="preserve"> PAGEREF _Toc242026084 \h </w:instrText>
             </w:r>
             <w:r>
               <w:rPr>
@@ -2265,7 +2264,7 @@
               <w14:ligatures w14:val="standardContextual"/>
             </w:rPr>
           </w:pPr>
-          <w:hyperlink w:anchor="_Toc242025243" w:history="1">
+          <w:hyperlink w:anchor="_Toc242026085" w:history="1">
             <w:r>
               <w:rPr>
                 <w:rStyle w:val="Hyperlink"/>
@@ -2292,7 +2291,7 @@
                 <w:noProof/>
                 <w:webHidden/>
               </w:rPr>
-              <w:instrText xml:space="preserve"> PAGEREF _Toc242025243 \h </w:instrText>
+              <w:instrText xml:space="preserve"> PAGEREF _Toc242026085 \h </w:instrText>
             </w:r>
             <w:r>
               <w:rPr>
@@ -2334,7 +2333,7 @@
               <w14:ligatures w14:val="standardContextual"/>
             </w:rPr>
           </w:pPr>
-          <w:hyperlink w:anchor="_Toc242025244" w:history="1">
+          <w:hyperlink w:anchor="_Toc242026086" w:history="1">
             <w:r>
               <w:rPr>
                 <w:rStyle w:val="Hyperlink"/>
@@ -2361,7 +2360,7 @@
                 <w:noProof/>
                 <w:webHidden/>
               </w:rPr>
-              <w:instrText xml:space="preserve"> PAGEREF _Toc242025244 \h </w:instrText>
+              <w:instrText xml:space="preserve"> PAGEREF _Toc242026086 \h </w:instrText>
             </w:r>
             <w:r>
               <w:rPr>
@@ -2403,7 +2402,7 @@
               <w14:ligatures w14:val="standardContextual"/>
             </w:rPr>
           </w:pPr>
-          <w:hyperlink w:anchor="_Toc242025245" w:history="1">
+          <w:hyperlink w:anchor="_Toc242026087" w:history="1">
             <w:r>
               <w:rPr>
                 <w:rStyle w:val="Hyperlink"/>
@@ -2430,7 +2429,7 @@
                 <w:noProof/>
                 <w:webHidden/>
               </w:rPr>
-              <w:instrText xml:space="preserve"> PAGEREF _Toc242025245 \h </w:instrText>
+              <w:instrText xml:space="preserve"> PAGEREF _Toc242026087 \h </w:instrText>
             </w:r>
             <w:r>
               <w:rPr>
@@ -2472,7 +2471,7 @@
               <w14:ligatures w14:val="standardContextual"/>
             </w:rPr>
           </w:pPr>
-          <w:hyperlink w:anchor="_Toc242025246" w:history="1">
+          <w:hyperlink w:anchor="_Toc242026088" w:history="1">
             <w:r>
               <w:rPr>
                 <w:rStyle w:val="Hyperlink"/>
@@ -2499,7 +2498,7 @@
                 <w:noProof/>
                 <w:webHidden/>
               </w:rPr>
-              <w:instrText xml:space="preserve"> PAGEREF _Toc242025246 \h </w:instrText>
+              <w:instrText xml:space="preserve"> PAGEREF _Toc242026088 \h </w:instrText>
             </w:r>
             <w:r>
               <w:rPr>
@@ -2541,7 +2540,7 @@
               <w14:ligatures w14:val="standardContextual"/>
             </w:rPr>
           </w:pPr>
-          <w:hyperlink w:anchor="_Toc242025247" w:history="1">
+          <w:hyperlink w:anchor="_Toc242026089" w:history="1">
             <w:r>
               <w:rPr>
                 <w:rStyle w:val="Hyperlink"/>
@@ -2568,7 +2567,7 @@
                 <w:noProof/>
                 <w:webHidden/>
               </w:rPr>
-              <w:instrText xml:space="preserve"> PAGEREF _Toc242025247 \h </w:instrText>
+              <w:instrText xml:space="preserve"> PAGEREF _Toc242026089 \h </w:instrText>
             </w:r>
             <w:r>
               <w:rPr>
@@ -2610,7 +2609,7 @@
               <w14:ligatures w14:val="standardContextual"/>
             </w:rPr>
           </w:pPr>
-          <w:hyperlink w:anchor="_Toc242025248" w:history="1">
+          <w:hyperlink w:anchor="_Toc242026090" w:history="1">
             <w:r>
               <w:rPr>
                 <w:rStyle w:val="Hyperlink"/>
@@ -2637,7 +2636,7 @@
                 <w:noProof/>
                 <w:webHidden/>
               </w:rPr>
-              <w:instrText xml:space="preserve"> PAGEREF _Toc242025248 \h </w:instrText>
+              <w:instrText xml:space="preserve"> PAGEREF _Toc242026090 \h </w:instrText>
             </w:r>
             <w:r>
               <w:rPr>
@@ -2679,7 +2678,7 @@
               <w14:ligatures w14:val="standardContextual"/>
             </w:rPr>
           </w:pPr>
-          <w:hyperlink w:anchor="_Toc242025249" w:history="1">
+          <w:hyperlink w:anchor="_Toc242026091" w:history="1">
             <w:r>
               <w:rPr>
                 <w:rStyle w:val="Hyperlink"/>
@@ -2706,7 +2705,7 @@
                 <w:noProof/>
                 <w:webHidden/>
               </w:rPr>
-              <w:instrText xml:space="preserve"> PAGEREF _Toc242025249 \h </w:instrText>
+              <w:instrText xml:space="preserve"> PAGEREF _Toc242026091 \h </w:instrText>
             </w:r>
             <w:r>
               <w:rPr>
@@ -2748,7 +2747,7 @@
               <w14:ligatures w14:val="standardContextual"/>
             </w:rPr>
           </w:pPr>
-          <w:hyperlink w:anchor="_Toc242025250" w:history="1">
+          <w:hyperlink w:anchor="_Toc242026092" w:history="1">
             <w:r>
               <w:rPr>
                 <w:rStyle w:val="Hyperlink"/>
@@ -2775,7 +2774,7 @@
                 <w:noProof/>
                 <w:webHidden/>
               </w:rPr>
-              <w:instrText xml:space="preserve"> PAGEREF _Toc242025250 \h </w:instrText>
+              <w:instrText xml:space="preserve"> PAGEREF _Toc242026092 \h </w:instrText>
             </w:r>
             <w:r>
               <w:rPr>
@@ -2831,13 +2830,11 @@
         <w:keepNext/>
         <w:keepLines/>
       </w:pPr>
-      <w:bookmarkStart w:id="0" w:name="sec_intro"/>
-      <w:bookmarkStart w:id="1" w:name="_Toc242025241"/>
+      <w:bookmarkStart w:id="0" w:name="_Toc242026083"/>
       <w:r>
         <w:t>1. INTRODUÇÃO</w:t>
       </w:r>
       <w:bookmarkEnd w:id="0"/>
-      <w:bookmarkEnd w:id="1"/>
     </w:p>
     <w:p>
       <w:pPr>
@@ -2871,13 +2868,11 @@
         <w:keepNext/>
         <w:keepLines/>
       </w:pPr>
-      <w:bookmarkStart w:id="2" w:name="sec_dados_basicos"/>
-      <w:bookmarkStart w:id="3" w:name="_Toc242025242"/>
+      <w:bookmarkStart w:id="1" w:name="_Toc242026084"/>
       <w:r>
         <w:t>2. DADOS BÁSICOS DO CURSO</w:t>
       </w:r>
-      <w:bookmarkEnd w:id="2"/>
-      <w:bookmarkEnd w:id="3"/>
+      <w:bookmarkEnd w:id="1"/>
     </w:p>
     <w:p>
       <w:r>
@@ -2907,8 +2902,7 @@
         <w:keepLines/>
         <w:spacing w:before="200" w:after="120"/>
       </w:pPr>
-      <w:bookmarkStart w:id="4" w:name="tab_1"/>
-      <w:bookmarkStart w:id="5" w:name="_Toc242025259"/>
+      <w:bookmarkStart w:id="2" w:name="_Toc242026101"/>
       <w:r>
         <w:t xml:space="preserve">Tabela </w:t>
       </w:r>
@@ -2933,8 +2927,7 @@
       <w:r>
         <w:t>. Municípios convocados.</w:t>
       </w:r>
-      <w:bookmarkEnd w:id="4"/>
-      <w:bookmarkEnd w:id="5"/>
+      <w:bookmarkEnd w:id="2"/>
     </w:p>
     <w:tbl>
       <w:tblPr>
@@ -3172,8 +3165,7 @@
         <w:keepLines/>
         <w:spacing w:before="200" w:after="120"/>
       </w:pPr>
-      <w:bookmarkStart w:id="6" w:name="tab_2"/>
-      <w:bookmarkStart w:id="7" w:name="_Toc242025260"/>
+      <w:bookmarkStart w:id="3" w:name="_Toc242026102"/>
       <w:r>
         <w:t xml:space="preserve">Tabela </w:t>
       </w:r>
@@ -3198,8 +3190,7 @@
       <w:r>
         <w:t>. Estrutura do curso de capacitação em transporte escolar.</w:t>
       </w:r>
-      <w:bookmarkEnd w:id="6"/>
-      <w:bookmarkEnd w:id="7"/>
+      <w:bookmarkEnd w:id="3"/>
     </w:p>
     <w:tbl>
       <w:tblPr>
@@ -3478,13 +3469,11 @@
         <w:keepNext/>
         <w:keepLines/>
       </w:pPr>
-      <w:bookmarkStart w:id="8" w:name="sec_contato"/>
-      <w:bookmarkStart w:id="9" w:name="_Toc242025243"/>
+      <w:bookmarkStart w:id="4" w:name="_Toc242026085"/>
       <w:r>
         <w:t>3. CONTATO COM OS MUNICÍPIOS</w:t>
       </w:r>
-      <w:bookmarkEnd w:id="8"/>
-      <w:bookmarkEnd w:id="9"/>
+      <w:bookmarkEnd w:id="4"/>
     </w:p>
     <w:p>
       <w:r>
@@ -3511,8 +3500,7 @@
         <w:keepLines/>
         <w:spacing w:before="200" w:after="120"/>
       </w:pPr>
-      <w:bookmarkStart w:id="10" w:name="tab_3"/>
-      <w:bookmarkStart w:id="11" w:name="_Toc242025261"/>
+      <w:bookmarkStart w:id="5" w:name="_Toc242026103"/>
       <w:r>
         <w:t xml:space="preserve">Tabela </w:t>
       </w:r>
@@ -3537,8 +3525,7 @@
       <w:r>
         <w:t>. Inscritos por município.</w:t>
       </w:r>
-      <w:bookmarkEnd w:id="10"/>
-      <w:bookmarkEnd w:id="11"/>
+      <w:bookmarkEnd w:id="5"/>
     </w:p>
     <w:tbl>
       <w:tblPr>
@@ -4128,13 +4115,11 @@
         <w:keepNext/>
         <w:keepLines/>
       </w:pPr>
-      <w:bookmarkStart w:id="12" w:name="sec_desenv"/>
-      <w:bookmarkStart w:id="13" w:name="_Toc242025244"/>
+      <w:bookmarkStart w:id="6" w:name="_Toc242026086"/>
       <w:r>
         <w:t>4. DESENVOLVIMENTO DO CURSO</w:t>
       </w:r>
-      <w:bookmarkEnd w:id="12"/>
-      <w:bookmarkEnd w:id="13"/>
+      <w:bookmarkEnd w:id="6"/>
     </w:p>
     <w:p>
       <w:r>
@@ -4273,8 +4258,7 @@
         <w:keepLines/>
         <w:spacing w:before="200"/>
       </w:pPr>
-      <w:bookmarkStart w:id="14" w:name="fig_1"/>
-      <w:bookmarkStart w:id="15" w:name="_Toc242025251"/>
+      <w:bookmarkStart w:id="7" w:name="_Toc242026093"/>
       <w:r>
         <w:t xml:space="preserve">Figura </w:t>
       </w:r>
@@ -4299,8 +4283,7 @@
       <w:r>
         <w:t>: Avaliação via ferramenta kahoot.</w:t>
       </w:r>
-      <w:bookmarkEnd w:id="14"/>
-      <w:bookmarkEnd w:id="15"/>
+      <w:bookmarkEnd w:id="7"/>
     </w:p>
     <w:p>
       <w:pPr>
@@ -4314,10 +4297,10 @@
           <w:noProof/>
         </w:rPr>
         <w:drawing>
-          <wp:inline distT="0" distB="0" distL="0" distR="0" wp14:anchorId="272BA662" wp14:editId="509ACFA6">
+          <wp:inline distT="0" distB="0" distL="0" distR="0" wp14:anchorId="2DA90C02" wp14:editId="493E6797">
             <wp:extent cx="4552950" cy="2571750"/>
             <wp:effectExtent l="0" t="0" r="0" b="0"/>
-            <wp:docPr id="30547469" name="Imagem 30547469"/>
+            <wp:docPr id="1840564066" name="Imagem 1840564066"/>
             <wp:cNvGraphicFramePr>
               <a:graphicFrameLocks xmlns:a="http://schemas.openxmlformats.org/drawingml/2006/main" noChangeAspect="1"/>
             </wp:cNvGraphicFramePr>
@@ -4376,8 +4359,7 @@
         <w:keepLines/>
         <w:spacing w:before="200"/>
       </w:pPr>
-      <w:bookmarkStart w:id="16" w:name="fig_2"/>
-      <w:bookmarkStart w:id="17" w:name="_Toc242025252"/>
+      <w:bookmarkStart w:id="8" w:name="_Toc242026094"/>
       <w:r>
         <w:t xml:space="preserve">Figura </w:t>
       </w:r>
@@ -4402,8 +4384,7 @@
       <w:r>
         <w:t>: Avaliação via ferramenta Plickers.</w:t>
       </w:r>
-      <w:bookmarkEnd w:id="16"/>
-      <w:bookmarkEnd w:id="17"/>
+      <w:bookmarkEnd w:id="8"/>
     </w:p>
     <w:p>
       <w:pPr>
@@ -4417,10 +4398,10 @@
           <w:noProof/>
         </w:rPr>
         <w:drawing>
-          <wp:inline distT="0" distB="0" distL="0" distR="0" wp14:anchorId="5E1CE92C" wp14:editId="162A1CF8">
+          <wp:inline distT="0" distB="0" distL="0" distR="0" wp14:anchorId="7A18F4E7" wp14:editId="2A783516">
             <wp:extent cx="3019425" cy="1924050"/>
             <wp:effectExtent l="0" t="0" r="0" b="0"/>
-            <wp:docPr id="1243663595" name="Imagem 1243663595"/>
+            <wp:docPr id="1910627783" name="Imagem 1910627783"/>
             <wp:cNvGraphicFramePr>
               <a:graphicFrameLocks xmlns:a="http://schemas.openxmlformats.org/drawingml/2006/main" noChangeAspect="1"/>
             </wp:cNvGraphicFramePr>
@@ -4487,8 +4468,7 @@
         <w:keepLines/>
         <w:spacing w:before="200" w:after="120"/>
       </w:pPr>
-      <w:bookmarkStart w:id="18" w:name="tab_4"/>
-      <w:bookmarkStart w:id="19" w:name="_Toc242025262"/>
+      <w:bookmarkStart w:id="9" w:name="_Toc242026104"/>
       <w:r>
         <w:t xml:space="preserve">Tabela </w:t>
       </w:r>
@@ -4513,8 +4493,7 @@
       <w:r>
         <w:t>. Participação por município.</w:t>
       </w:r>
-      <w:bookmarkEnd w:id="18"/>
-      <w:bookmarkEnd w:id="19"/>
+      <w:bookmarkEnd w:id="9"/>
     </w:p>
     <w:tbl>
       <w:tblPr>
@@ -5110,10 +5089,10 @@
           <w:noProof/>
         </w:rPr>
         <w:drawing>
-          <wp:inline distT="0" distB="0" distL="0" distR="0" wp14:anchorId="68A623B8" wp14:editId="48B52A93">
+          <wp:inline distT="0" distB="0" distL="0" distR="0" wp14:anchorId="60994782" wp14:editId="7359411B">
             <wp:extent cx="9525" cy="9525"/>
             <wp:effectExtent l="0" t="0" r="0" b="0"/>
-            <wp:docPr id="185391896" name="Imagem 185391896"/>
+            <wp:docPr id="48733728" name="Imagem 48733728"/>
             <wp:cNvGraphicFramePr>
               <a:graphicFrameLocks xmlns:a="http://schemas.openxmlformats.org/drawingml/2006/main" noChangeAspect="1"/>
             </wp:cNvGraphicFramePr>
@@ -5156,8 +5135,7 @@
         <w:keepLines/>
         <w:spacing w:after="40"/>
       </w:pPr>
-      <w:bookmarkStart w:id="20" w:name="fig_3"/>
-      <w:bookmarkStart w:id="21" w:name="_Toc242025253"/>
+      <w:bookmarkStart w:id="10" w:name="_Toc242026095"/>
       <w:r>
         <w:t xml:space="preserve">Figura </w:t>
       </w:r>
@@ -5182,8 +5160,7 @@
       <w:r>
         <w:t>. Participação segundo o tipo de representação.</w:t>
       </w:r>
-      <w:bookmarkEnd w:id="20"/>
-      <w:bookmarkEnd w:id="21"/>
+      <w:bookmarkEnd w:id="10"/>
     </w:p>
     <w:p>
       <w:pPr>
@@ -5215,13 +5192,11 @@
         <w:keepNext/>
         <w:keepLines/>
       </w:pPr>
-      <w:bookmarkStart w:id="22" w:name="sec_avaliacao"/>
-      <w:bookmarkStart w:id="23" w:name="_Toc242025245"/>
+      <w:bookmarkStart w:id="11" w:name="_Toc242026087"/>
       <w:r>
         <w:t>5. AVALIAÇÃO DA CAPACITAÇÃO</w:t>
       </w:r>
-      <w:bookmarkEnd w:id="22"/>
-      <w:bookmarkEnd w:id="23"/>
+      <w:bookmarkEnd w:id="11"/>
     </w:p>
     <w:p>
       <w:r>
@@ -5243,10 +5218,10 @@
           <w:noProof/>
         </w:rPr>
         <w:drawing>
-          <wp:inline distT="0" distB="0" distL="0" distR="0" wp14:anchorId="692F3659" wp14:editId="5344D237">
+          <wp:inline distT="0" distB="0" distL="0" distR="0" wp14:anchorId="4223A4D1" wp14:editId="6C76B114">
             <wp:extent cx="9525" cy="9525"/>
             <wp:effectExtent l="0" t="0" r="0" b="0"/>
-            <wp:docPr id="781780742" name="Imagem 781780742"/>
+            <wp:docPr id="1320736802" name="Imagem 1320736802"/>
             <wp:cNvGraphicFramePr>
               <a:graphicFrameLocks xmlns:a="http://schemas.openxmlformats.org/drawingml/2006/main" noChangeAspect="1"/>
             </wp:cNvGraphicFramePr>
@@ -5289,8 +5264,7 @@
         <w:keepLines/>
         <w:spacing w:after="40"/>
       </w:pPr>
-      <w:bookmarkStart w:id="24" w:name="fig_4"/>
-      <w:bookmarkStart w:id="25" w:name="_Toc242025254"/>
+      <w:bookmarkStart w:id="12" w:name="_Toc242026096"/>
       <w:r>
         <w:t xml:space="preserve">Figura </w:t>
       </w:r>
@@ -5315,8 +5289,7 @@
       <w:r>
         <w:t>. Avaliação da capacitação de todos os participantes.</w:t>
       </w:r>
-      <w:bookmarkEnd w:id="24"/>
-      <w:bookmarkEnd w:id="25"/>
+      <w:bookmarkEnd w:id="12"/>
     </w:p>
     <w:p>
       <w:pPr>
@@ -5346,10 +5319,10 @@
           <w:noProof/>
         </w:rPr>
         <w:drawing>
-          <wp:inline distT="0" distB="0" distL="0" distR="0" wp14:anchorId="124178AD" wp14:editId="74BF3F83">
+          <wp:inline distT="0" distB="0" distL="0" distR="0" wp14:anchorId="20742D3A" wp14:editId="23F7BF59">
             <wp:extent cx="9525" cy="9525"/>
             <wp:effectExtent l="0" t="0" r="0" b="0"/>
-            <wp:docPr id="920869359" name="Imagem 920869359"/>
+            <wp:docPr id="1676746171" name="Imagem 1676746171"/>
             <wp:cNvGraphicFramePr>
               <a:graphicFrameLocks xmlns:a="http://schemas.openxmlformats.org/drawingml/2006/main" noChangeAspect="1"/>
             </wp:cNvGraphicFramePr>
@@ -5392,8 +5365,7 @@
         <w:keepLines/>
         <w:spacing w:after="40"/>
       </w:pPr>
-      <w:bookmarkStart w:id="26" w:name="fig_5"/>
-      <w:bookmarkStart w:id="27" w:name="_Toc242025255"/>
+      <w:bookmarkStart w:id="13" w:name="_Toc242026097"/>
       <w:r>
         <w:t xml:space="preserve">Figura </w:t>
       </w:r>
@@ -5418,8 +5390,7 @@
       <w:r>
         <w:t>. Avaliação da capacitação dos conselheiros CACS.</w:t>
       </w:r>
-      <w:bookmarkEnd w:id="26"/>
-      <w:bookmarkEnd w:id="27"/>
+      <w:bookmarkEnd w:id="13"/>
     </w:p>
     <w:p>
       <w:pPr>
@@ -5449,10 +5420,10 @@
           <w:noProof/>
         </w:rPr>
         <w:drawing>
-          <wp:inline distT="0" distB="0" distL="0" distR="0" wp14:anchorId="67F48D68" wp14:editId="2BE1C2B2">
+          <wp:inline distT="0" distB="0" distL="0" distR="0" wp14:anchorId="7274726D" wp14:editId="7856A92B">
             <wp:extent cx="9525" cy="9525"/>
             <wp:effectExtent l="0" t="0" r="0" b="0"/>
-            <wp:docPr id="1853533787" name="Imagem 1853533787"/>
+            <wp:docPr id="1478589888" name="Imagem 1478589888"/>
             <wp:cNvGraphicFramePr>
               <a:graphicFrameLocks xmlns:a="http://schemas.openxmlformats.org/drawingml/2006/main" noChangeAspect="1"/>
             </wp:cNvGraphicFramePr>
@@ -5495,8 +5466,7 @@
         <w:keepLines/>
         <w:spacing w:after="40"/>
       </w:pPr>
-      <w:bookmarkStart w:id="28" w:name="fig_6"/>
-      <w:bookmarkStart w:id="29" w:name="_Toc242025256"/>
+      <w:bookmarkStart w:id="14" w:name="_Toc242026098"/>
       <w:r>
         <w:t xml:space="preserve">Figura </w:t>
       </w:r>
@@ -5521,8 +5491,7 @@
       <w:r>
         <w:t>. Avaliação da capacitação dos gestores municipais.</w:t>
       </w:r>
-      <w:bookmarkEnd w:id="28"/>
-      <w:bookmarkEnd w:id="29"/>
+      <w:bookmarkEnd w:id="14"/>
     </w:p>
     <w:p>
       <w:pPr>
@@ -5552,10 +5521,10 @@
           <w:noProof/>
         </w:rPr>
         <w:drawing>
-          <wp:inline distT="0" distB="0" distL="0" distR="0" wp14:anchorId="0EF7006E" wp14:editId="34D846AA">
+          <wp:inline distT="0" distB="0" distL="0" distR="0" wp14:anchorId="2FA4D447" wp14:editId="617072CB">
             <wp:extent cx="9525" cy="9525"/>
             <wp:effectExtent l="0" t="0" r="0" b="0"/>
-            <wp:docPr id="744404207" name="Imagem 744404207"/>
+            <wp:docPr id="1592439194" name="Imagem 1592439194"/>
             <wp:cNvGraphicFramePr>
               <a:graphicFrameLocks xmlns:a="http://schemas.openxmlformats.org/drawingml/2006/main" noChangeAspect="1"/>
             </wp:cNvGraphicFramePr>
@@ -5598,8 +5567,7 @@
         <w:keepLines/>
         <w:spacing w:after="40"/>
       </w:pPr>
-      <w:bookmarkStart w:id="30" w:name="fig_7"/>
-      <w:bookmarkStart w:id="31" w:name="_Toc242025257"/>
+      <w:bookmarkStart w:id="15" w:name="_Toc242026099"/>
       <w:r>
         <w:t xml:space="preserve">Figura </w:t>
       </w:r>
@@ -5624,8 +5592,7 @@
       <w:r>
         <w:t>. Aspectos que gostaram da capacitação.</w:t>
       </w:r>
-      <w:bookmarkEnd w:id="30"/>
-      <w:bookmarkEnd w:id="31"/>
+      <w:bookmarkEnd w:id="15"/>
     </w:p>
     <w:p>
       <w:pPr>
@@ -5655,10 +5622,10 @@
           <w:noProof/>
         </w:rPr>
         <w:drawing>
-          <wp:inline distT="0" distB="0" distL="0" distR="0" wp14:anchorId="681BC544" wp14:editId="0C6BB5EC">
+          <wp:inline distT="0" distB="0" distL="0" distR="0" wp14:anchorId="31F0CF22" wp14:editId="7E4708B7">
             <wp:extent cx="9525" cy="9525"/>
             <wp:effectExtent l="0" t="0" r="0" b="0"/>
-            <wp:docPr id="1234496427" name="Imagem 1234496427"/>
+            <wp:docPr id="1194665894" name="Imagem 1194665894"/>
             <wp:cNvGraphicFramePr>
               <a:graphicFrameLocks xmlns:a="http://schemas.openxmlformats.org/drawingml/2006/main" noChangeAspect="1"/>
             </wp:cNvGraphicFramePr>
@@ -5701,8 +5668,7 @@
         <w:keepLines/>
         <w:spacing w:after="40"/>
       </w:pPr>
-      <w:bookmarkStart w:id="32" w:name="fig_8"/>
-      <w:bookmarkStart w:id="33" w:name="_Toc242025258"/>
+      <w:bookmarkStart w:id="16" w:name="_Toc242026100"/>
       <w:r>
         <w:t xml:space="preserve">Figura </w:t>
       </w:r>
@@ -5727,8 +5693,7 @@
       <w:r>
         <w:t>. Aspectos que devem melhorar da capacitação.</w:t>
       </w:r>
-      <w:bookmarkEnd w:id="32"/>
-      <w:bookmarkEnd w:id="33"/>
+      <w:bookmarkEnd w:id="16"/>
     </w:p>
     <w:p>
       <w:pPr>
@@ -5752,13 +5717,11 @@
         <w:keepNext/>
         <w:keepLines/>
       </w:pPr>
-      <w:bookmarkStart w:id="34" w:name="sec_fotos"/>
-      <w:bookmarkStart w:id="35" w:name="_Toc242025246"/>
+      <w:bookmarkStart w:id="17" w:name="_Toc242026088"/>
       <w:r>
         <w:t>6. REGISTROS FOTOGRÁFICOS DA CAPACITAÇÃO</w:t>
       </w:r>
-      <w:bookmarkEnd w:id="34"/>
-      <w:bookmarkEnd w:id="35"/>
+      <w:bookmarkEnd w:id="17"/>
     </w:p>
     <w:p>
       <w:r>
@@ -5784,13 +5747,11 @@
         <w:keepNext/>
         <w:keepLines/>
       </w:pPr>
-      <w:bookmarkStart w:id="36" w:name="sec_consideracoes"/>
-      <w:bookmarkStart w:id="37" w:name="_Toc242025247"/>
+      <w:bookmarkStart w:id="18" w:name="_Toc242026089"/>
       <w:r>
         <w:t>7. CONSIDERAÇÕES FINAIS</w:t>
       </w:r>
-      <w:bookmarkEnd w:id="36"/>
-      <w:bookmarkEnd w:id="37"/>
+      <w:bookmarkEnd w:id="18"/>
     </w:p>
     <w:p>
       <w:r>
@@ -5832,13 +5793,11 @@
         <w:keepNext/>
         <w:keepLines/>
       </w:pPr>
-      <w:bookmarkStart w:id="38" w:name="sec_apendice_1"/>
-      <w:bookmarkStart w:id="39" w:name="_Toc242025248"/>
+      <w:bookmarkStart w:id="19" w:name="_Toc242026090"/>
       <w:r>
         <w:t>APÊNDICE I – CONVOCAÇÕES DO FNDE</w:t>
       </w:r>
-      <w:bookmarkEnd w:id="38"/>
-      <w:bookmarkEnd w:id="39"/>
+      <w:bookmarkEnd w:id="19"/>
     </w:p>
     <w:p>
       <w:pPr>
@@ -5859,13 +5818,11 @@
         <w:keepNext/>
         <w:keepLines/>
       </w:pPr>
-      <w:bookmarkStart w:id="40" w:name="sec_apendice_2"/>
-      <w:bookmarkStart w:id="41" w:name="_Toc242025249"/>
+      <w:bookmarkStart w:id="20" w:name="_Toc242026091"/>
       <w:r>
         <w:t>APÊNDICE II – CONVOCAÇÕES DO CECATE</w:t>
       </w:r>
-      <w:bookmarkEnd w:id="40"/>
-      <w:bookmarkEnd w:id="41"/>
+      <w:bookmarkEnd w:id="20"/>
     </w:p>
     <w:p>
       <w:pPr>
@@ -5886,13 +5843,11 @@
         <w:keepNext/>
         <w:keepLines/>
       </w:pPr>
-      <w:bookmarkStart w:id="42" w:name="sec_apendice_3"/>
-      <w:bookmarkStart w:id="43" w:name="_Toc242025250"/>
+      <w:bookmarkStart w:id="21" w:name="_Toc242026092"/>
       <w:r>
         <w:t>APÊNDICE III – RESPOSTAS DISSERTATIVAS DA AVALIAÇÃO</w:t>
       </w:r>
-      <w:bookmarkEnd w:id="42"/>
-      <w:bookmarkEnd w:id="43"/>
+      <w:bookmarkEnd w:id="21"/>
     </w:p>
     <w:p>
       <w:r>
@@ -5998,10 +5953,10 @@
               <w:noProof/>
             </w:rPr>
             <w:drawing>
-              <wp:inline distT="0" distB="0" distL="0" distR="0" wp14:anchorId="1F654ACC" wp14:editId="0BF3250B">
+              <wp:inline distT="0" distB="0" distL="0" distR="0" wp14:anchorId="6DC347D1" wp14:editId="77A70812">
                 <wp:extent cx="4191000" cy="257175"/>
                 <wp:effectExtent l="0" t="0" r="0" b="0"/>
-                <wp:docPr id="487594422" name="Imagem 487594422"/>
+                <wp:docPr id="800239552" name="Imagem 800239552"/>
                 <wp:cNvGraphicFramePr>
                   <a:graphicFrameLocks xmlns:a="http://schemas.openxmlformats.org/drawingml/2006/main" noChangeAspect="1"/>
                 </wp:cNvGraphicFramePr>
@@ -6091,10 +6046,10 @@
               <w:noProof/>
             </w:rPr>
             <w:drawing>
-              <wp:inline distT="0" distB="0" distL="0" distR="0" wp14:anchorId="41598AA3" wp14:editId="23285F9D">
+              <wp:inline distT="0" distB="0" distL="0" distR="0" wp14:anchorId="07313FEC" wp14:editId="076E0167">
                 <wp:extent cx="4191000" cy="257175"/>
                 <wp:effectExtent l="0" t="0" r="0" b="0"/>
-                <wp:docPr id="1729435741" name="Imagem 1729435741"/>
+                <wp:docPr id="35082973" name="Imagem 35082973"/>
                 <wp:cNvGraphicFramePr>
                   <a:graphicFrameLocks xmlns:a="http://schemas.openxmlformats.org/drawingml/2006/main" noChangeAspect="1"/>
                 </wp:cNvGraphicFramePr>
@@ -6188,10 +6143,10 @@
               <w:noProof/>
             </w:rPr>
             <w:drawing>
-              <wp:inline distT="0" distB="0" distL="0" distR="0" wp14:anchorId="3704BF53" wp14:editId="4C2CB4A2">
+              <wp:inline distT="0" distB="0" distL="0" distR="0" wp14:anchorId="77165457" wp14:editId="2EAE79BA">
                 <wp:extent cx="4095750" cy="252413"/>
                 <wp:effectExtent l="0" t="0" r="0" b="0"/>
-                <wp:docPr id="1374013742" name="Imagem 1374013742"/>
+                <wp:docPr id="1541475616" name="Imagem 1541475616"/>
                 <wp:cNvGraphicFramePr>
                   <a:graphicFrameLocks xmlns:a="http://schemas.openxmlformats.org/drawingml/2006/main" noChangeAspect="1"/>
                 </wp:cNvGraphicFramePr>
@@ -6368,10 +6323,10 @@
               <w:noProof/>
             </w:rPr>
             <w:drawing>
-              <wp:inline distT="0" distB="0" distL="0" distR="0" wp14:anchorId="09E0BB91" wp14:editId="0D884F5E">
+              <wp:inline distT="0" distB="0" distL="0" distR="0" wp14:anchorId="5DED9126" wp14:editId="7DE64D52">
                 <wp:extent cx="1238250" cy="257175"/>
                 <wp:effectExtent l="0" t="0" r="0" b="0"/>
-                <wp:docPr id="486180410" name="Imagem 486180410"/>
+                <wp:docPr id="305067953" name="Imagem 305067953"/>
                 <wp:cNvGraphicFramePr>
                   <a:graphicFrameLocks xmlns:a="http://schemas.openxmlformats.org/drawingml/2006/main" noChangeAspect="1"/>
                 </wp:cNvGraphicFramePr>
@@ -6482,10 +6437,10 @@
               <w:noProof/>
             </w:rPr>
             <w:drawing>
-              <wp:inline distT="0" distB="0" distL="0" distR="0" wp14:anchorId="5EE8E00D" wp14:editId="26E840A5">
+              <wp:inline distT="0" distB="0" distL="0" distR="0" wp14:anchorId="22387688" wp14:editId="6B27F607">
                 <wp:extent cx="1238250" cy="257175"/>
                 <wp:effectExtent l="0" t="0" r="0" b="0"/>
-                <wp:docPr id="924230803" name="Imagem 924230803"/>
+                <wp:docPr id="1696979941" name="Imagem 1696979941"/>
                 <wp:cNvGraphicFramePr>
                   <a:graphicFrameLocks xmlns:a="http://schemas.openxmlformats.org/drawingml/2006/main" noChangeAspect="1"/>
                 </wp:cNvGraphicFramePr>
@@ -6553,10 +6508,10 @@
 <file path=word/numbering.xml><?xml version="1.0" encoding="utf-8"?>
 <w:numbering xmlns:wpc="http://schemas.microsoft.com/office/word/2010/wordprocessingCanvas" xmlns:cx="http://schemas.microsoft.com/office/drawing/2014/chartex" xmlns:cx1="http://schemas.microsoft.com/office/drawing/2015/9/8/chartex" xmlns:cx2="http://schemas.microsoft.com/office/drawing/2015/10/21/chartex" xmlns:cx3="http://schemas.microsoft.com/office/drawing/2016/5/9/chartex" xmlns:cx4="http://schemas.microsoft.com/office/drawing/2016/5/10/chartex" xmlns:cx5="http://schemas.microsoft.com/office/drawing/2016/5/11/chartex" xmlns:cx6="http://schemas.microsoft.com/office/drawing/2016/5/12/chartex" xmlns:cx7="http://schemas.microsoft.com/office/drawing/2016/5/13/chartex" xmlns:cx8="http://schemas.microsoft.com/office/drawing/2016/5/14/chartex" xmlns:mc="http://schemas.openxmlformats.org/markup-compatibility/2006" xmlns:aink="http://schemas.microsoft.com/office/drawing/2016/ink" xmlns:am3d="http://schemas.microsoft.com/office/drawing/2017/model3d" xmlns:o="urn:schemas-microsoft-com:office:office" xmlns:oel="http://schemas.microsoft.com/office/2019/extlst" xmlns:r="http://schemas.openxmlformats.org/officeDocument/2006/relationships" xmlns:m="http://schemas.openxmlformats.org/officeDocument/2006/math" xmlns:v="urn:schemas-microsoft-com:vml" xmlns:wp14="http://schemas.microsoft.com/office/word/2010/wordprocessingDrawing" xmlns:wp="http://schemas.openxmlformats.org/drawingml/2006/wordprocessingDrawing" xmlns:w10="urn:schemas-microsoft-com:office:word" xmlns:w="http://schemas.openxmlformats.org/wordprocessingml/2006/main" xmlns:w14="http://schemas.microsoft.com/office/word/2010/wordml" xmlns:w15="http://schemas.microsoft.com/office/word/2012/wordml" xmlns:w16cex="http://schemas.microsoft.com/office/word/2018/wordml/cex" xmlns:w16cid="http://schemas.microsoft.com/office/word/2016/wordml/cid" xmlns:w16="http://schemas.microsoft.com/office/word/2018/wordml" xmlns:w16du="http://schemas.microsoft.com/office/word/2023/wordml/word16du" xmlns:w16sdtdh="http://schemas.microsoft.com/office/word/2020/wordml/sdtdatahash" xmlns:w16sdtfl="http://schemas.microsoft.com/office/word/2024/wordml/sdtformatlock" xmlns:w16se="http://schemas.microsoft.com/office/word/2015/wordml/symex" xmlns:wpg="http://schemas.microsoft.com/office/word/2010/wordprocessingGroup" xmlns:wpi="http://schemas.microsoft.com/office/word/2010/wordprocessingInk" xmlns:wne="http://schemas.microsoft.com/office/word/2006/wordml" xmlns:wps="http://schemas.microsoft.com/office/word/2010/wordprocessingShape" mc:Ignorable="w14 w15 w16se w16cid w16 w16cex w16sdtdh w16sdtfl w16du wp14">
   <w:abstractNum w:abstractNumId="0" w15:restartNumberingAfterBreak="0">
-    <w:nsid w:val="0FCB18F5"/>
+    <w:nsid w:val="43B24C0D"/>
     <w:multiLevelType w:val="hybridMultilevel"/>
-    <w:tmpl w:val="F6CA28AE"/>
-    <w:lvl w:ilvl="0" w:tplc="EBDE4168">
+    <w:tmpl w:val="2466E694"/>
+    <w:lvl w:ilvl="0" w:tplc="7AD49834">
       <w:start w:val="1"/>
       <w:numFmt w:val="bullet"/>
       <w:lvlText w:val="●"/>
@@ -6565,7 +6520,7 @@
         <w:ind w:left="720" w:hanging="360"/>
       </w:pPr>
     </w:lvl>
-    <w:lvl w:ilvl="1" w:tplc="ABD824C6">
+    <w:lvl w:ilvl="1" w:tplc="98E4F242">
       <w:start w:val="1"/>
       <w:numFmt w:val="bullet"/>
       <w:lvlText w:val="○"/>
@@ -6574,7 +6529,7 @@
         <w:ind w:left="1440" w:hanging="360"/>
       </w:pPr>
     </w:lvl>
-    <w:lvl w:ilvl="2" w:tplc="21064732">
+    <w:lvl w:ilvl="2" w:tplc="94BED900">
       <w:start w:val="1"/>
       <w:numFmt w:val="bullet"/>
       <w:lvlText w:val="■"/>
@@ -6583,7 +6538,7 @@
         <w:ind w:left="2160" w:hanging="360"/>
       </w:pPr>
     </w:lvl>
-    <w:lvl w:ilvl="3" w:tplc="D99CCE0A">
+    <w:lvl w:ilvl="3" w:tplc="8CDA1A84">
       <w:start w:val="1"/>
       <w:numFmt w:val="bullet"/>
       <w:lvlText w:val="●"/>
@@ -6592,7 +6547,7 @@
         <w:ind w:left="2880" w:hanging="360"/>
       </w:pPr>
     </w:lvl>
-    <w:lvl w:ilvl="4" w:tplc="FE385AB8">
+    <w:lvl w:ilvl="4" w:tplc="87EC11E4">
       <w:start w:val="1"/>
       <w:numFmt w:val="bullet"/>
       <w:lvlText w:val="○"/>
@@ -6601,7 +6556,7 @@
         <w:ind w:left="3600" w:hanging="360"/>
       </w:pPr>
     </w:lvl>
-    <w:lvl w:ilvl="5" w:tplc="D1625848">
+    <w:lvl w:ilvl="5" w:tplc="C63A3DC2">
       <w:start w:val="1"/>
       <w:numFmt w:val="bullet"/>
       <w:lvlText w:val="■"/>
@@ -6610,7 +6565,7 @@
         <w:ind w:left="4320" w:hanging="360"/>
       </w:pPr>
     </w:lvl>
-    <w:lvl w:ilvl="6" w:tplc="2DA2F9F2">
+    <w:lvl w:ilvl="6" w:tplc="C6F2CB36">
       <w:start w:val="1"/>
       <w:numFmt w:val="bullet"/>
       <w:lvlText w:val="●"/>
@@ -6619,7 +6574,7 @@
         <w:ind w:left="5040" w:hanging="360"/>
       </w:pPr>
     </w:lvl>
-    <w:lvl w:ilvl="7" w:tplc="3FCE456C">
+    <w:lvl w:ilvl="7" w:tplc="840C53BE">
       <w:start w:val="1"/>
       <w:numFmt w:val="bullet"/>
       <w:lvlText w:val="●"/>
@@ -6628,7 +6583,7 @@
         <w:ind w:left="5760" w:hanging="360"/>
       </w:pPr>
     </w:lvl>
-    <w:lvl w:ilvl="8" w:tplc="9160990E">
+    <w:lvl w:ilvl="8" w:tplc="FF503A10">
       <w:start w:val="1"/>
       <w:numFmt w:val="bullet"/>
       <w:lvlText w:val="●"/>
@@ -6638,7 +6593,7 @@
       </w:pPr>
     </w:lvl>
   </w:abstractNum>
-  <w:num w:numId="1" w16cid:durableId="171187673">
+  <w:num w:numId="1" w16cid:durableId="1309819260">
     <w:abstractNumId w:val="0"/>
     <w:lvlOverride w:ilvl="0">
       <w:startOverride w:val="1"/>
@@ -7231,6 +7186,7 @@
     <w:qFormat/>
     <w:pPr>
       <w:spacing w:before="240" w:after="140"/>
+      <w:jc w:val="center"/>
     </w:pPr>
     <w:rPr>
       <w:b/>

</xml_diff>